<commit_message>
Rebuild onboarding guides with Run 3 corrections
Gate submission wording, the mentor's gate recommendation step, manager
sign-off fields, Pitch Studio's Free practice path, and test-outs that can
be taken in a locked part of a stage.

Co-Authored-By: Claude Opus 5.5 <noreply@anthropic.com>
</commit_message>
<xml_diff>
--- a/docs/onboarding/New-Hire-Onboarding-Workflow.docx
+++ b/docs/onboarding/New-Hire-Onboarding-Workflow.docx
@@ -2087,7 +2087,7 @@
         <w:rPr>
           <w:rFonts w:ascii="Arial" w:cs="Arial" w:eastAsia="Arial" w:hAnsi="Arial"/>
         </w:rPr>
-        <w:t xml:space="preserve">. A confirmation says the mentor can now see it.</w:t>
+        <w:t xml:space="preserve">. The confirmation says it's saved; the mentor sees it once you choose one in step 6.</w:t>
       </w:r>
     </w:p>
     <w:p>
@@ -7688,7 +7688,7 @@
               <w:rPr>
                 <w:rFonts w:ascii="Arial" w:cs="Arial" w:eastAsia="Arial" w:hAnsi="Arial"/>
               </w:rPr>
-              <w:t xml:space="preserve">The new hire's answer is kept as submitted, and your note reaches them as feedback. Approving counts the step toward their progress. Stage gates don't show these buttons because the manager signs them off.</w:t>
+              <w:t xml:space="preserve">The new hire's answer is kept as submitted, and your note reaches them as feedback. Approving counts the step toward their progress. Stage gates don't show these buttons because the manager signs them off; see step 4.</w:t>
             </w:r>
           </w:p>
         </w:tc>
@@ -7827,7 +7827,7 @@
         <w:pStyle w:val="Heading3"/>
       </w:pPr>
       <w:r>
-        <w:t xml:space="preserve">4. Confirm the result</w:t>
+        <w:t xml:space="preserve">4. Recommend on a stage gate</w:t>
       </w:r>
     </w:p>
     <w:p>
@@ -7843,21 +7843,35 @@
         <w:rPr>
           <w:rFonts w:ascii="Arial" w:cs="Arial" w:eastAsia="Arial" w:hAnsi="Arial"/>
         </w:rPr>
-        <w:t xml:space="preserve">The panel shows the decision and your note, for example </w:t>
-      </w:r>
-      <w:r>
-        <w:rPr>
-          <w:rFonts w:ascii="Arial" w:cs="Arial" w:eastAsia="Arial" w:hAnsi="Arial"/>
-          <w:b/>
-          <w:bCs/>
-        </w:rPr>
-        <w:t xml:space="preserve">Approved. Steve has been told, with your note.</w:t>
-      </w:r>
-      <w:r>
-        <w:rPr>
-          <w:rFonts w:ascii="Arial" w:cs="Arial" w:eastAsia="Arial" w:hAnsi="Arial"/>
-        </w:rPr>
-        <w:t xml:space="preserve"> Nothing is left waiting.</w:t>
+        <w:t xml:space="preserve">When the new hire submits a test-out or sign-off, </w:t>
+      </w:r>
+      <w:r>
+        <w:rPr>
+          <w:rFonts w:ascii="Arial" w:cs="Arial" w:eastAsia="Arial" w:hAnsi="Arial"/>
+          <w:b/>
+          <w:bCs/>
+        </w:rPr>
+        <w:t xml:space="preserve">Review</w:t>
+      </w:r>
+      <w:r>
+        <w:rPr>
+          <w:rFonts w:ascii="Arial" w:cs="Arial" w:eastAsia="Arial" w:hAnsi="Arial"/>
+        </w:rPr>
+        <w:t xml:space="preserve"> opens the gate step. Instead of Approve, it has </w:t>
+      </w:r>
+      <w:r>
+        <w:rPr>
+          <w:rFonts w:ascii="Arial" w:cs="Arial" w:eastAsia="Arial" w:hAnsi="Arial"/>
+          <w:b/>
+          <w:bCs/>
+        </w:rPr>
+        <w:t xml:space="preserve">Your recommendation</w:t>
+      </w:r>
+      <w:r>
+        <w:rPr>
+          <w:rFonts w:ascii="Arial" w:cs="Arial" w:eastAsia="Arial" w:hAnsi="Arial"/>
+        </w:rPr>
+        <w:t xml:space="preserve">.</w:t>
       </w:r>
     </w:p>
     <w:p>
@@ -7873,9 +7887,153 @@
         <w:rPr>
           <w:rFonts w:ascii="Arial" w:cs="Arial" w:eastAsia="Arial" w:hAnsi="Arial"/>
         </w:rPr>
-        <w:t xml:space="preserve">The new hire is told the step was approved or sent back, with your note; the notification opens the step.</w:t>
-      </w:r>
-    </w:p>
+        <w:t xml:space="preserve">Choose </w:t>
+      </w:r>
+      <w:r>
+        <w:rPr>
+          <w:rFonts w:ascii="Arial" w:cs="Arial" w:eastAsia="Arial" w:hAnsi="Arial"/>
+          <w:b/>
+          <w:bCs/>
+        </w:rPr>
+        <w:t xml:space="preserve">Ready for sign-off</w:t>
+      </w:r>
+      <w:r>
+        <w:rPr>
+          <w:rFonts w:ascii="Arial" w:cs="Arial" w:eastAsia="Arial" w:hAnsi="Arial"/>
+        </w:rPr>
+        <w:t xml:space="preserve"> or </w:t>
+      </w:r>
+      <w:r>
+        <w:rPr>
+          <w:rFonts w:ascii="Arial" w:cs="Arial" w:eastAsia="Arial" w:hAnsi="Arial"/>
+          <w:b/>
+          <w:bCs/>
+        </w:rPr>
+        <w:t xml:space="preserve">Not ready yet</w:t>
+      </w:r>
+      <w:r>
+        <w:rPr>
+          <w:rFonts w:ascii="Arial" w:cs="Arial" w:eastAsia="Arial" w:hAnsi="Arial"/>
+        </w:rPr>
+        <w:t xml:space="preserve">, write why, and click </w:t>
+      </w:r>
+      <w:r>
+        <w:rPr>
+          <w:rFonts w:ascii="Arial" w:cs="Arial" w:eastAsia="Arial" w:hAnsi="Arial"/>
+          <w:b/>
+          <w:bCs/>
+        </w:rPr>
+        <w:t xml:space="preserve">Send to the manager</w:t>
+      </w:r>
+      <w:r>
+        <w:rPr>
+          <w:rFonts w:ascii="Arial" w:cs="Arial" w:eastAsia="Arial" w:hAnsi="Arial"/>
+        </w:rPr>
+        <w:t xml:space="preserve">.</w:t>
+      </w:r>
+    </w:p>
+    <w:p>
+      <w:pPr>
+        <w:pStyle w:val="ListParagraph"/>
+        <w:numPr>
+          <w:ilvl w:val="0"/>
+          <w:numId w:val="2"/>
+        </w:numPr>
+        <w:spacing w:after="80" w:line="290"/>
+      </w:pPr>
+      <w:r>
+        <w:rPr>
+          <w:rFonts w:ascii="Arial" w:cs="Arial" w:eastAsia="Arial" w:hAnsi="Arial"/>
+        </w:rPr>
+        <w:t xml:space="preserve">The gate then leaves your waiting count and shows as </w:t>
+      </w:r>
+      <w:r>
+        <w:rPr>
+          <w:rFonts w:ascii="Arial" w:cs="Arial" w:eastAsia="Arial" w:hAnsi="Arial"/>
+          <w:b/>
+          <w:bCs/>
+        </w:rPr>
+        <w:t xml:space="preserve">Manager sign-off pending</w:t>
+      </w:r>
+      <w:r>
+        <w:rPr>
+          <w:rFonts w:ascii="Arial" w:cs="Arial" w:eastAsia="Arial" w:hAnsi="Arial"/>
+        </w:rPr>
+        <w:t xml:space="preserve">; the manager decides.</w:t>
+      </w:r>
+    </w:p>
+    <w:p>
+      <w:pPr>
+        <w:spacing w:after="120"/>
+      </w:pPr>
+    </w:p>
+    <w:tbl>
+      <w:tblPr>
+        <w:tblW w:type="dxa" w:w="9360"/>
+        <w:tblBorders>
+          <w:top w:val="single" w:color="auto" w:sz="4"/>
+          <w:left w:val="single" w:color="auto" w:sz="4"/>
+          <w:bottom w:val="single" w:color="auto" w:sz="4"/>
+          <w:right w:val="single" w:color="auto" w:sz="4"/>
+          <w:insideH w:val="single" w:color="auto" w:sz="4"/>
+          <w:insideV w:val="single" w:color="auto" w:sz="4"/>
+        </w:tblBorders>
+      </w:tblPr>
+      <w:tblGrid>
+        <w:gridCol w:w="9360"/>
+      </w:tblGrid>
+      <w:tr>
+        <w:trPr>
+          <w:cantSplit/>
+        </w:trPr>
+        <w:tc>
+          <w:tcPr>
+            <w:tcW w:type="dxa" w:w="9360"/>
+            <w:tcBorders>
+              <w:top w:val="none"/>
+              <w:left w:val="single" w:color="0B2A6F" w:sz="24"/>
+              <w:bottom w:val="none"/>
+              <w:right w:val="none"/>
+            </w:tcBorders>
+            <w:shd w:fill="FFF6DB" w:color="auto" w:val="clear"/>
+            <w:tcMar>
+              <w:top w:type="dxa" w:w="120"/>
+              <w:left w:type="dxa" w:w="200"/>
+              <w:bottom w:type="dxa" w:w="120"/>
+              <w:right w:type="dxa" w:w="200"/>
+            </w:tcMar>
+          </w:tcPr>
+          <w:p>
+            <w:pPr>
+              <w:spacing w:line="290"/>
+            </w:pPr>
+            <w:r>
+              <w:rPr>
+                <w:rFonts w:ascii="Arial" w:cs="Arial" w:eastAsia="Arial" w:hAnsi="Arial"/>
+                <w:b/>
+                <w:bCs/>
+                <w:color w:val="0B2A6F"/>
+              </w:rPr>
+              <w:t xml:space="preserve">Fill in:  </w:t>
+            </w:r>
+            <w:r>
+              <w:rPr>
+                <w:rFonts w:ascii="Arial" w:cs="Arial" w:eastAsia="Arial" w:hAnsi="Arial"/>
+                <w:b/>
+                <w:bCs/>
+              </w:rPr>
+              <w:t xml:space="preserve">Why:</w:t>
+            </w:r>
+            <w:r>
+              <w:rPr>
+                <w:rFonts w:ascii="Arial" w:cs="Arial" w:eastAsia="Arial" w:hAnsi="Arial"/>
+              </w:rPr>
+              <w:t xml:space="preserve"> what you saw that shows they meet the gate's criteria, or what they still need.</w:t>
+            </w:r>
+          </w:p>
+        </w:tc>
+      </w:tr>
+    </w:tbl>
     <w:p>
       <w:pPr>
         <w:spacing w:after="120"/>
@@ -7934,6 +8092,138 @@
               <w:rPr>
                 <w:rFonts w:ascii="Arial" w:cs="Arial" w:eastAsia="Arial" w:hAnsi="Arial"/>
               </w:rPr>
+              <w:t xml:space="preserve">The manager signs off each gate, and your recommendation is the evidence they decide on. New hires can take gates early, so this may come well before day 30.</w:t>
+            </w:r>
+          </w:p>
+        </w:tc>
+      </w:tr>
+    </w:tbl>
+    <w:p>
+      <w:pPr>
+        <w:pStyle w:val="Heading3"/>
+      </w:pPr>
+      <w:r>
+        <w:t xml:space="preserve">5. Confirm the result</w:t>
+      </w:r>
+    </w:p>
+    <w:p>
+      <w:pPr>
+        <w:pStyle w:val="ListParagraph"/>
+        <w:numPr>
+          <w:ilvl w:val="0"/>
+          <w:numId w:val="2"/>
+        </w:numPr>
+        <w:spacing w:after="80" w:line="290"/>
+      </w:pPr>
+      <w:r>
+        <w:rPr>
+          <w:rFonts w:ascii="Arial" w:cs="Arial" w:eastAsia="Arial" w:hAnsi="Arial"/>
+        </w:rPr>
+        <w:t xml:space="preserve">The step's status changes to </w:t>
+      </w:r>
+      <w:r>
+        <w:rPr>
+          <w:rFonts w:ascii="Arial" w:cs="Arial" w:eastAsia="Arial" w:hAnsi="Arial"/>
+          <w:b/>
+          <w:bCs/>
+        </w:rPr>
+        <w:t xml:space="preserve">Approved</w:t>
+      </w:r>
+      <w:r>
+        <w:rPr>
+          <w:rFonts w:ascii="Arial" w:cs="Arial" w:eastAsia="Arial" w:hAnsi="Arial"/>
+        </w:rPr>
+        <w:t xml:space="preserve">, your note shows under </w:t>
+      </w:r>
+      <w:r>
+        <w:rPr>
+          <w:rFonts w:ascii="Arial" w:cs="Arial" w:eastAsia="Arial" w:hAnsi="Arial"/>
+          <w:b/>
+          <w:bCs/>
+        </w:rPr>
+        <w:t xml:space="preserve">Feedback to</w:t>
+      </w:r>
+      <w:r>
+        <w:rPr>
+          <w:rFonts w:ascii="Arial" w:cs="Arial" w:eastAsia="Arial" w:hAnsi="Arial"/>
+        </w:rPr>
+        <w:t xml:space="preserve"> the new hire, and a confirmation says they have been told. Nothing is left waiting.</w:t>
+      </w:r>
+    </w:p>
+    <w:p>
+      <w:pPr>
+        <w:pStyle w:val="ListParagraph"/>
+        <w:numPr>
+          <w:ilvl w:val="0"/>
+          <w:numId w:val="2"/>
+        </w:numPr>
+        <w:spacing w:after="80" w:line="290"/>
+      </w:pPr>
+      <w:r>
+        <w:rPr>
+          <w:rFonts w:ascii="Arial" w:cs="Arial" w:eastAsia="Arial" w:hAnsi="Arial"/>
+        </w:rPr>
+        <w:t xml:space="preserve">The new hire is told the step was approved or sent back, with your note; the notification opens the step.</w:t>
+      </w:r>
+    </w:p>
+    <w:p>
+      <w:pPr>
+        <w:spacing w:after="120"/>
+      </w:pPr>
+    </w:p>
+    <w:tbl>
+      <w:tblPr>
+        <w:tblW w:type="dxa" w:w="9360"/>
+        <w:tblBorders>
+          <w:top w:val="single" w:color="auto" w:sz="4"/>
+          <w:left w:val="single" w:color="auto" w:sz="4"/>
+          <w:bottom w:val="single" w:color="auto" w:sz="4"/>
+          <w:right w:val="single" w:color="auto" w:sz="4"/>
+          <w:insideH w:val="single" w:color="auto" w:sz="4"/>
+          <w:insideV w:val="single" w:color="auto" w:sz="4"/>
+        </w:tblBorders>
+      </w:tblPr>
+      <w:tblGrid>
+        <w:gridCol w:w="9360"/>
+      </w:tblGrid>
+      <w:tr>
+        <w:trPr>
+          <w:cantSplit/>
+        </w:trPr>
+        <w:tc>
+          <w:tcPr>
+            <w:tcW w:type="dxa" w:w="9360"/>
+            <w:tcBorders>
+              <w:top w:val="none"/>
+              <w:left w:val="single" w:color="0B2A6F" w:sz="24"/>
+              <w:bottom w:val="none"/>
+              <w:right w:val="none"/>
+            </w:tcBorders>
+            <w:shd w:fill="EEF3FC" w:color="auto" w:val="clear"/>
+            <w:tcMar>
+              <w:top w:type="dxa" w:w="120"/>
+              <w:left w:type="dxa" w:w="200"/>
+              <w:bottom w:type="dxa" w:w="120"/>
+              <w:right w:type="dxa" w:w="200"/>
+            </w:tcMar>
+          </w:tcPr>
+          <w:p>
+            <w:pPr>
+              <w:spacing w:line="290"/>
+            </w:pPr>
+            <w:r>
+              <w:rPr>
+                <w:rFonts w:ascii="Arial" w:cs="Arial" w:eastAsia="Arial" w:hAnsi="Arial"/>
+                <w:b/>
+                <w:bCs/>
+                <w:color w:val="0B2A6F"/>
+              </w:rPr>
+              <w:t xml:space="preserve">Why it matters:  </w:t>
+            </w:r>
+            <w:r>
+              <w:rPr>
+                <w:rFonts w:ascii="Arial" w:cs="Arial" w:eastAsia="Arial" w:hAnsi="Arial"/>
+              </w:rPr>
               <w:t xml:space="preserve">Both sides see the same status, so there's no doubt about where the step stands.</w:t>
             </w:r>
           </w:p>
@@ -8073,7 +8363,7 @@
         <w:pStyle w:val="Heading3"/>
       </w:pPr>
       <w:r>
-        <w:t xml:space="preserve">5. Keep checking in</w:t>
+        <w:t xml:space="preserve">6. Keep checking in</w:t>
       </w:r>
     </w:p>
     <w:p>
@@ -8269,7 +8559,7 @@
         <w:pStyle w:val="Heading3"/>
       </w:pPr>
       <w:r>
-        <w:t xml:space="preserve">6. Prepare them for stage gates</w:t>
+        <w:t xml:space="preserve">7. Prepare them for stage gates</w:t>
       </w:r>
     </w:p>
     <w:p>
@@ -8389,7 +8679,7 @@
         <w:pStyle w:val="Heading3"/>
       </w:pPr>
       <w:r>
-        <w:t xml:space="preserve">7. Pitches and simulations your mentee shares</w:t>
+        <w:t xml:space="preserve">8. Pitches and simulations your mentee shares</w:t>
       </w:r>
     </w:p>
     <w:p>
@@ -9403,7 +9693,135 @@
         <w:rPr>
           <w:rFonts w:ascii="Arial" w:cs="Arial" w:eastAsia="Arial" w:hAnsi="Arial"/>
         </w:rPr>
-        <w:t xml:space="preserve">Open it, review the evidence against the criteria, and approve or send it back.</w:t>
+        <w:t xml:space="preserve">Open it. The mentor's recommendation is shown on the left. </w:t>
+      </w:r>
+      <w:r>
+        <w:rPr>
+          <w:rFonts w:ascii="Arial" w:cs="Arial" w:eastAsia="Arial" w:hAnsi="Arial"/>
+          <w:b/>
+          <w:bCs/>
+        </w:rPr>
+        <w:t xml:space="preserve">Your sign-off</w:t>
+      </w:r>
+      <w:r>
+        <w:rPr>
+          <w:rFonts w:ascii="Arial" w:cs="Arial" w:eastAsia="Arial" w:hAnsi="Arial"/>
+        </w:rPr>
+        <w:t xml:space="preserve"> may come pre-filled by an AI coaching brief; rewrite anything that isn't what you saw.</w:t>
+      </w:r>
+    </w:p>
+    <w:p>
+      <w:pPr>
+        <w:pStyle w:val="ListParagraph"/>
+        <w:numPr>
+          <w:ilvl w:val="0"/>
+          <w:numId w:val="2"/>
+        </w:numPr>
+        <w:spacing w:after="80" w:line="290"/>
+      </w:pPr>
+      <w:r>
+        <w:rPr>
+          <w:rFonts w:ascii="Arial" w:cs="Arial" w:eastAsia="Arial" w:hAnsi="Arial"/>
+        </w:rPr>
+        <w:t xml:space="preserve">Fill in </w:t>
+      </w:r>
+      <w:r>
+        <w:rPr>
+          <w:rFonts w:ascii="Arial" w:cs="Arial" w:eastAsia="Arial" w:hAnsi="Arial"/>
+          <w:b/>
+          <w:bCs/>
+        </w:rPr>
+        <w:t xml:space="preserve">Strength observed</w:t>
+      </w:r>
+      <w:r>
+        <w:rPr>
+          <w:rFonts w:ascii="Arial" w:cs="Arial" w:eastAsia="Arial" w:hAnsi="Arial"/>
+        </w:rPr>
+        <w:t xml:space="preserve">, </w:t>
+      </w:r>
+      <w:r>
+        <w:rPr>
+          <w:rFonts w:ascii="Arial" w:cs="Arial" w:eastAsia="Arial" w:hAnsi="Arial"/>
+          <w:b/>
+          <w:bCs/>
+        </w:rPr>
+        <w:t xml:space="preserve">Gap to address</w:t>
+      </w:r>
+      <w:r>
+        <w:rPr>
+          <w:rFonts w:ascii="Arial" w:cs="Arial" w:eastAsia="Arial" w:hAnsi="Arial"/>
+        </w:rPr>
+        <w:t xml:space="preserve">, </w:t>
+      </w:r>
+      <w:r>
+        <w:rPr>
+          <w:rFonts w:ascii="Arial" w:cs="Arial" w:eastAsia="Arial" w:hAnsi="Arial"/>
+          <w:b/>
+          <w:bCs/>
+        </w:rPr>
+        <w:t xml:space="preserve">Concrete next action</w:t>
+      </w:r>
+      <w:r>
+        <w:rPr>
+          <w:rFonts w:ascii="Arial" w:cs="Arial" w:eastAsia="Arial" w:hAnsi="Arial"/>
+        </w:rPr>
+        <w:t xml:space="preserve"> and </w:t>
+      </w:r>
+      <w:r>
+        <w:rPr>
+          <w:rFonts w:ascii="Arial" w:cs="Arial" w:eastAsia="Arial" w:hAnsi="Arial"/>
+          <w:b/>
+          <w:bCs/>
+        </w:rPr>
+        <w:t xml:space="preserve">Readiness confidence</w:t>
+      </w:r>
+      <w:r>
+        <w:rPr>
+          <w:rFonts w:ascii="Arial" w:cs="Arial" w:eastAsia="Arial" w:hAnsi="Arial"/>
+        </w:rPr>
+        <w:t xml:space="preserve">. Gates also need </w:t>
+      </w:r>
+      <w:r>
+        <w:rPr>
+          <w:rFonts w:ascii="Arial" w:cs="Arial" w:eastAsia="Arial" w:hAnsi="Arial"/>
+          <w:b/>
+          <w:bCs/>
+        </w:rPr>
+        <w:t xml:space="preserve">Live coaching attestation</w:t>
+      </w:r>
+      <w:r>
+        <w:rPr>
+          <w:rFonts w:ascii="Arial" w:cs="Arial" w:eastAsia="Arial" w:hAnsi="Arial"/>
+        </w:rPr>
+        <w:t xml:space="preserve">: tick it only if you saw them do it yourself (in a 1:1, call shadow or live review) and say what you observed. Then click </w:t>
+      </w:r>
+      <w:r>
+        <w:rPr>
+          <w:rFonts w:ascii="Arial" w:cs="Arial" w:eastAsia="Arial" w:hAnsi="Arial"/>
+          <w:b/>
+          <w:bCs/>
+        </w:rPr>
+        <w:t xml:space="preserve">Approve</w:t>
+      </w:r>
+      <w:r>
+        <w:rPr>
+          <w:rFonts w:ascii="Arial" w:cs="Arial" w:eastAsia="Arial" w:hAnsi="Arial"/>
+        </w:rPr>
+        <w:t xml:space="preserve">, or </w:t>
+      </w:r>
+      <w:r>
+        <w:rPr>
+          <w:rFonts w:ascii="Arial" w:cs="Arial" w:eastAsia="Arial" w:hAnsi="Arial"/>
+          <w:b/>
+          <w:bCs/>
+        </w:rPr>
+        <w:t xml:space="preserve">Request changes</w:t>
+      </w:r>
+      <w:r>
+        <w:rPr>
+          <w:rFonts w:ascii="Arial" w:cs="Arial" w:eastAsia="Arial" w:hAnsi="Arial"/>
+        </w:rPr>
+        <w:t xml:space="preserve">.</w:t>
       </w:r>
     </w:p>
     <w:p>
@@ -9971,7 +10389,35 @@
         <w:rPr>
           <w:rFonts w:ascii="Arial" w:cs="Arial" w:eastAsia="Arial" w:hAnsi="Arial"/>
         </w:rPr>
-        <w:t xml:space="preserve">Pick a scenario, then answer by </w:t>
+        <w:t xml:space="preserve">Choose </w:t>
+      </w:r>
+      <w:r>
+        <w:rPr>
+          <w:rFonts w:ascii="Arial" w:cs="Arial" w:eastAsia="Arial" w:hAnsi="Arial"/>
+          <w:b/>
+          <w:bCs/>
+        </w:rPr>
+        <w:t xml:space="preserve">Free practice</w:t>
+      </w:r>
+      <w:r>
+        <w:rPr>
+          <w:rFonts w:ascii="Arial" w:cs="Arial" w:eastAsia="Arial" w:hAnsi="Arial"/>
+        </w:rPr>
+        <w:t xml:space="preserve">, then pick a scenario under </w:t>
+      </w:r>
+      <w:r>
+        <w:rPr>
+          <w:rFonts w:ascii="Arial" w:cs="Arial" w:eastAsia="Arial" w:hAnsi="Arial"/>
+          <w:b/>
+          <w:bCs/>
+        </w:rPr>
+        <w:t xml:space="preserve">From playbooks</w:t>
+      </w:r>
+      <w:r>
+        <w:rPr>
+          <w:rFonts w:ascii="Arial" w:cs="Arial" w:eastAsia="Arial" w:hAnsi="Arial"/>
+        </w:rPr>
+        <w:t xml:space="preserve"> (the page may open on a practice scenario, which is video only). Answer by </w:t>
       </w:r>
       <w:r>
         <w:rPr>

</xml_diff>